<commit_message>
docs(rainrs-server): document the data model and regenerate the report
The report gained a data model section: a diagram of the model and one
table per entity (field, type, nullable, description), both generated
from the catalogue in rainrs_server/model/schema.py, so the document
cannot drift away from the code. The class and component diagrams now
show the input, process and output layers.

All six diagrams were verified programmatically: no text leaves its
frame, no two labels overlap and no arrow crosses a box.

The READMEs describe the new layout, agent/PLAN.md lists the layers and
the data flow, agent/TASKS.md marks S-004 done with the verification of
every acceptance criterion, and docs/decisions/0003 records the split
and the declarative catalogue.
</commit_message>
<xml_diff>
--- a/rainrs-collection/rainrs-server/docs/rainrs-server-documentation.docx
+++ b/rainrs-collection/rainrs-server/docs/rainrs-server-documentation.docx
@@ -86,7 +86,7 @@
         <w:pStyle w:val="ListBullet"/>
       </w:pPr>
       <w:r>
-        <w:t>7. Data flow and storage layout</w:t>
+        <w:t>7. Data model</w:t>
       </w:r>
     </w:p>
     <w:p>
@@ -94,7 +94,7 @@
         <w:pStyle w:val="ListBullet"/>
       </w:pPr>
       <w:r>
-        <w:t>8. Command line usage</w:t>
+        <w:t>8. Data flow and storage layout</w:t>
       </w:r>
     </w:p>
     <w:p>
@@ -102,7 +102,7 @@
         <w:pStyle w:val="ListBullet"/>
       </w:pPr>
       <w:r>
-        <w:t>9. Security considerations</w:t>
+        <w:t>9. Command line usage</w:t>
       </w:r>
     </w:p>
     <w:p>
@@ -110,7 +110,7 @@
         <w:pStyle w:val="ListBullet"/>
       </w:pPr>
       <w:r>
-        <w:t>10. Limitations and known issues</w:t>
+        <w:t>10. Security considerations</w:t>
       </w:r>
     </w:p>
     <w:p>
@@ -118,7 +118,15 @@
         <w:pStyle w:val="ListBullet"/>
       </w:pPr>
       <w:r>
-        <w:t>11. Verification results</w:t>
+        <w:t>11. Limitations and known issues</w:t>
+      </w:r>
+    </w:p>
+    <w:p>
+      <w:pPr>
+        <w:pStyle w:val="ListBullet"/>
+      </w:pPr>
+      <w:r>
+        <w:t>12. Verification results</w:t>
       </w:r>
     </w:p>
     <w:p>
@@ -146,7 +154,12 @@
     </w:p>
     <w:p>
       <w:r>
-        <w:t>The generated material is an experimental research artifact. It is not a production cryptographic key - see section 9.</w:t>
+        <w:t>The application is organised as a simple MVC split. The model (rainrs_server.model) describes every value that flows through the pipeline; the input layer (rainrs_server.input) owns the incoming captures; the process layer (rainrs_server.process) computes with the model; and the output layer (rainrs_server.output) stores the results. Section 7 shows the shape of the data itself.</w:t>
+      </w:r>
+    </w:p>
+    <w:p>
+      <w:r>
+        <w:t>The generated material is an experimental research artifact. It is not a production cryptographic key - see section 10.</w:t>
       </w:r>
     </w:p>
     <w:p>
@@ -302,7 +315,7 @@
         <w:jc w:val="center"/>
       </w:pPr>
       <w:r>
-        <w:t>Figure 3 - Classes of the detection stage, the derivation stage, the data model and the persistence layer.</w:t>
+        <w:t>Figure 3 - Classes of the input layer, the process layer, the output layer and the data model.</w:t>
       </w:r>
     </w:p>
     <w:p>
@@ -354,7 +367,7 @@
         <w:jc w:val="center"/>
       </w:pPr>
       <w:r>
-        <w:t>Figure 4 - Runtime sequence between the CLI, the extraction stage, the detector, the database and the derivation stage.</w:t>
+        <w:t>Figure 4 - Runtime sequence between the CLI, the extraction stage, the detector, the database and the derivation stage. The extractor reads the captures through the input layer (CaptureLibrary) and writes through the output layer (AttributeWriter and the SQLite database).</w:t>
       </w:r>
     </w:p>
     <w:p>
@@ -586,7 +599,2545 @@
         <w:pStyle w:val="Heading1"/>
       </w:pPr>
       <w:r>
-        <w:t>7. Data flow and storage layout</w:t>
+        <w:t>7. Data model</w:t>
+      </w:r>
+    </w:p>
+    <w:p>
+      <w:r>
+        <w:t>Every value that flows through the pipeline is described in the model package (rainrs_server/model). The package holds the dataclasses of the data and a declarative catalogue (rainrs_server/model/schema.py) that names the field, the type and the meaning of every entity. The catalogue is not a copy that can drift away from the code: the test suite compares it with the dataclasses and fails when a field was added, renamed or retyped without updating the catalogue.</w:t>
+      </w:r>
+    </w:p>
+    <w:p>
+      <w:r>
+        <w:drawing>
+          <wp:inline xmlns:a="http://schemas.openxmlformats.org/drawingml/2006/main" xmlns:pic="http://schemas.openxmlformats.org/drawingml/2006/picture">
+            <wp:extent cx="5943600" cy="4249271"/>
+            <wp:docPr id="6" name="Picture 6"/>
+            <wp:cNvGraphicFramePr>
+              <a:graphicFrameLocks noChangeAspect="1"/>
+            </wp:cNvGraphicFramePr>
+            <a:graphic>
+              <a:graphicData uri="http://schemas.openxmlformats.org/drawingml/2006/picture">
+                <pic:pic>
+                  <pic:nvPicPr>
+                    <pic:cNvPr id="0" name="data_model.png"/>
+                    <pic:cNvPicPr/>
+                  </pic:nvPicPr>
+                  <pic:blipFill>
+                    <a:blip r:embed="rId14"/>
+                    <a:stretch>
+                      <a:fillRect/>
+                    </a:stretch>
+                  </pic:blipFill>
+                  <pic:spPr>
+                    <a:xfrm>
+                      <a:off x="0" y="0"/>
+                      <a:ext cx="5943600" cy="4249271"/>
+                    </a:xfrm>
+                    <a:prstGeom prst="rect"/>
+                  </pic:spPr>
+                </pic:pic>
+              </a:graphicData>
+            </a:graphic>
+          </wp:inline>
+        </w:drawing>
+      </w:r>
+    </w:p>
+    <w:p>
+      <w:pPr>
+        <w:jc w:val="center"/>
+      </w:pPr>
+      <w:r>
+        <w:t>Figure 6 - The data model of the pipeline, generated from the catalogue in rainrs_server/model/schema.py.</w:t>
+      </w:r>
+    </w:p>
+    <w:p>
+      <w:r>
+        <w:t>The catalogue covers the following entities. The 'Stored in' column names the SQLite table the entity is persisted in; entities without a table are transient values that only live inside the pipeline.</w:t>
+      </w:r>
+    </w:p>
+    <w:tbl>
+      <w:tblPr>
+        <w:tblStyle w:val="LightGrid-Accent1"/>
+        <w:tblW w:type="auto" w:w="0"/>
+        <w:tblLook w:firstColumn="1" w:firstRow="1" w:lastColumn="0" w:lastRow="0" w:noHBand="0" w:noVBand="1" w:val="04A0"/>
+      </w:tblPr>
+      <w:tblGrid>
+        <w:gridCol w:w="2880"/>
+        <w:gridCol w:w="2880"/>
+        <w:gridCol w:w="2880"/>
+      </w:tblGrid>
+      <w:tr>
+        <w:tc>
+          <w:tcPr>
+            <w:tcW w:type="dxa" w:w="2880"/>
+          </w:tcPr>
+          <w:p>
+            <w:r>
+              <w:t>Entity</w:t>
+            </w:r>
+          </w:p>
+        </w:tc>
+        <w:tc>
+          <w:tcPr>
+            <w:tcW w:type="dxa" w:w="2880"/>
+          </w:tcPr>
+          <w:p>
+            <w:r>
+              <w:t>Stored in</w:t>
+            </w:r>
+          </w:p>
+        </w:tc>
+        <w:tc>
+          <w:tcPr>
+            <w:tcW w:type="dxa" w:w="2880"/>
+          </w:tcPr>
+          <w:p>
+            <w:r>
+              <w:t>Purpose</w:t>
+            </w:r>
+          </w:p>
+        </w:tc>
+      </w:tr>
+      <w:tr>
+        <w:tc>
+          <w:tcPr>
+            <w:tcW w:type="dxa" w:w="2880"/>
+          </w:tcPr>
+          <w:p>
+            <w:r>
+              <w:t>RippleDetection</w:t>
+            </w:r>
+          </w:p>
+        </w:tc>
+        <w:tc>
+          <w:tcPr>
+            <w:tcW w:type="dxa" w:w="2880"/>
+          </w:tcPr>
+          <w:p>
+            <w:r>
+              <w:t>ripples</w:t>
+            </w:r>
+          </w:p>
+        </w:tc>
+        <w:tc>
+          <w:tcPr>
+            <w:tcW w:type="dxa" w:w="2880"/>
+          </w:tcPr>
+          <w:p>
+            <w:r>
+              <w:t>One rain ripple detected inside a captured image.</w:t>
+            </w:r>
+          </w:p>
+        </w:tc>
+      </w:tr>
+      <w:tr>
+        <w:tc>
+          <w:tcPr>
+            <w:tcW w:type="dxa" w:w="2880"/>
+          </w:tcPr>
+          <w:p>
+            <w:r>
+              <w:t>DetectionResult</w:t>
+            </w:r>
+          </w:p>
+        </w:tc>
+        <w:tc>
+          <w:tcPr>
+            <w:tcW w:type="dxa" w:w="2880"/>
+          </w:tcPr>
+          <w:p>
+            <w:r>
+              <w:t>-</w:t>
+            </w:r>
+          </w:p>
+        </w:tc>
+        <w:tc>
+          <w:tcPr>
+            <w:tcW w:type="dxa" w:w="2880"/>
+          </w:tcPr>
+          <w:p>
+            <w:r>
+              <w:t>Raw detector output for a single image.</w:t>
+            </w:r>
+          </w:p>
+        </w:tc>
+      </w:tr>
+      <w:tr>
+        <w:tc>
+          <w:tcPr>
+            <w:tcW w:type="dxa" w:w="2880"/>
+          </w:tcPr>
+          <w:p>
+            <w:r>
+              <w:t>RippleAttributes</w:t>
+            </w:r>
+          </w:p>
+        </w:tc>
+        <w:tc>
+          <w:tcPr>
+            <w:tcW w:type="dxa" w:w="2880"/>
+          </w:tcPr>
+          <w:p>
+            <w:r>
+              <w:t>images</w:t>
+            </w:r>
+          </w:p>
+        </w:tc>
+        <w:tc>
+          <w:tcPr>
+            <w:tcW w:type="dxa" w:w="2880"/>
+          </w:tcPr>
+          <w:p>
+            <w:r>
+              <w:t>Every ripple measurement extracted from one captured image; the input of the Runge-Kutta key derivation.</w:t>
+            </w:r>
+          </w:p>
+        </w:tc>
+      </w:tr>
+      <w:tr>
+        <w:tc>
+          <w:tcPr>
+            <w:tcW w:type="dxa" w:w="2880"/>
+          </w:tcPr>
+          <w:p>
+            <w:r>
+              <w:t>ImageOutcome</w:t>
+            </w:r>
+          </w:p>
+        </w:tc>
+        <w:tc>
+          <w:tcPr>
+            <w:tcW w:type="dxa" w:w="2880"/>
+          </w:tcPr>
+          <w:p>
+            <w:r>
+              <w:t>-</w:t>
+            </w:r>
+          </w:p>
+        </w:tc>
+        <w:tc>
+          <w:tcPr>
+            <w:tcW w:type="dxa" w:w="2880"/>
+          </w:tcPr>
+          <w:p>
+            <w:r>
+              <w:t>Result of processing a single capture.</w:t>
+            </w:r>
+          </w:p>
+        </w:tc>
+      </w:tr>
+      <w:tr>
+        <w:tc>
+          <w:tcPr>
+            <w:tcW w:type="dxa" w:w="2880"/>
+          </w:tcPr>
+          <w:p>
+            <w:r>
+              <w:t>MasterKey</w:t>
+            </w:r>
+          </w:p>
+        </w:tc>
+        <w:tc>
+          <w:tcPr>
+            <w:tcW w:type="dxa" w:w="2880"/>
+          </w:tcPr>
+          <w:p>
+            <w:r>
+              <w:t>master_keys</w:t>
+            </w:r>
+          </w:p>
+        </w:tc>
+        <w:tc>
+          <w:tcPr>
+            <w:tcW w:type="dxa" w:w="2880"/>
+          </w:tcPr>
+          <w:p>
+            <w:r>
+              <w:t>Experimental master key derived from the averaged ripple attributes of one capture.</w:t>
+            </w:r>
+          </w:p>
+        </w:tc>
+      </w:tr>
+      <w:tr>
+        <w:tc>
+          <w:tcPr>
+            <w:tcW w:type="dxa" w:w="2880"/>
+          </w:tcPr>
+          <w:p>
+            <w:r>
+              <w:t>SlaveKey</w:t>
+            </w:r>
+          </w:p>
+        </w:tc>
+        <w:tc>
+          <w:tcPr>
+            <w:tcW w:type="dxa" w:w="2880"/>
+          </w:tcPr>
+          <w:p>
+            <w:r>
+              <w:t>slave_keys</w:t>
+            </w:r>
+          </w:p>
+        </w:tc>
+        <w:tc>
+          <w:tcPr>
+            <w:tcW w:type="dxa" w:w="2880"/>
+          </w:tcPr>
+          <w:p>
+            <w:r>
+              <w:t>Experimental slave key, derived from a single ripple and bound to exactly one master key.</w:t>
+            </w:r>
+          </w:p>
+        </w:tc>
+      </w:tr>
+      <w:tr>
+        <w:tc>
+          <w:tcPr>
+            <w:tcW w:type="dxa" w:w="2880"/>
+          </w:tcPr>
+          <w:p>
+            <w:r>
+              <w:t>RippleWaveParameters</w:t>
+            </w:r>
+          </w:p>
+        </w:tc>
+        <w:tc>
+          <w:tcPr>
+            <w:tcW w:type="dxa" w:w="2880"/>
+          </w:tcPr>
+          <w:p>
+            <w:r>
+              <w:t>-</w:t>
+            </w:r>
+          </w:p>
+        </w:tc>
+        <w:tc>
+          <w:tcPr>
+            <w:tcW w:type="dxa" w:w="2880"/>
+          </w:tcPr>
+          <w:p>
+            <w:r>
+              <w:t>Parameters of the coupled van der Pol oscillator system that the Runge-Kutta integration uses.</w:t>
+            </w:r>
+          </w:p>
+        </w:tc>
+      </w:tr>
+    </w:tbl>
+    <w:p>
+      <w:r>
+        <w:t>The fields of every entity:</w:t>
+      </w:r>
+    </w:p>
+    <w:p>
+      <w:pPr>
+        <w:pStyle w:val="Heading2"/>
+      </w:pPr>
+      <w:r>
+        <w:t>RippleDetection</w:t>
+      </w:r>
+    </w:p>
+    <w:p>
+      <w:r>
+        <w:t>One rain ripple detected inside a captured image.</w:t>
+      </w:r>
+    </w:p>
+    <w:tbl>
+      <w:tblPr>
+        <w:tblStyle w:val="LightGrid-Accent1"/>
+        <w:tblW w:type="auto" w:w="0"/>
+        <w:tblLook w:firstColumn="1" w:firstRow="1" w:lastColumn="0" w:lastRow="0" w:noHBand="0" w:noVBand="1" w:val="04A0"/>
+      </w:tblPr>
+      <w:tblGrid>
+        <w:gridCol w:w="2160"/>
+        <w:gridCol w:w="2160"/>
+        <w:gridCol w:w="2160"/>
+        <w:gridCol w:w="2160"/>
+      </w:tblGrid>
+      <w:tr>
+        <w:tc>
+          <w:tcPr>
+            <w:tcW w:type="dxa" w:w="2160"/>
+          </w:tcPr>
+          <w:p>
+            <w:r>
+              <w:t>Field</w:t>
+            </w:r>
+          </w:p>
+        </w:tc>
+        <w:tc>
+          <w:tcPr>
+            <w:tcW w:type="dxa" w:w="2160"/>
+          </w:tcPr>
+          <w:p>
+            <w:r>
+              <w:t>Type</w:t>
+            </w:r>
+          </w:p>
+        </w:tc>
+        <w:tc>
+          <w:tcPr>
+            <w:tcW w:type="dxa" w:w="2160"/>
+          </w:tcPr>
+          <w:p>
+            <w:r>
+              <w:t>Nullable</w:t>
+            </w:r>
+          </w:p>
+        </w:tc>
+        <w:tc>
+          <w:tcPr>
+            <w:tcW w:type="dxa" w:w="2160"/>
+          </w:tcPr>
+          <w:p>
+            <w:r>
+              <w:t>Description</w:t>
+            </w:r>
+          </w:p>
+        </w:tc>
+      </w:tr>
+      <w:tr>
+        <w:tc>
+          <w:tcPr>
+            <w:tcW w:type="dxa" w:w="2160"/>
+          </w:tcPr>
+          <w:p>
+            <w:r>
+              <w:t>index</w:t>
+            </w:r>
+          </w:p>
+        </w:tc>
+        <w:tc>
+          <w:tcPr>
+            <w:tcW w:type="dxa" w:w="2160"/>
+          </w:tcPr>
+          <w:p>
+            <w:r>
+              <w:t>int</w:t>
+            </w:r>
+          </w:p>
+        </w:tc>
+        <w:tc>
+          <w:tcPr>
+            <w:tcW w:type="dxa" w:w="2160"/>
+          </w:tcPr>
+          <w:p>
+            <w:r>
+              <w:t>no</w:t>
+            </w:r>
+          </w:p>
+        </w:tc>
+        <w:tc>
+          <w:tcPr>
+            <w:tcW w:type="dxa" w:w="2160"/>
+          </w:tcPr>
+          <w:p>
+            <w:r>
+              <w:t>Zero-based position of the ripple inside its image.</w:t>
+            </w:r>
+          </w:p>
+        </w:tc>
+      </w:tr>
+      <w:tr>
+        <w:tc>
+          <w:tcPr>
+            <w:tcW w:type="dxa" w:w="2160"/>
+          </w:tcPr>
+          <w:p>
+            <w:r>
+              <w:t>center_x</w:t>
+            </w:r>
+          </w:p>
+        </w:tc>
+        <w:tc>
+          <w:tcPr>
+            <w:tcW w:type="dxa" w:w="2160"/>
+          </w:tcPr>
+          <w:p>
+            <w:r>
+              <w:t>float</w:t>
+            </w:r>
+          </w:p>
+        </w:tc>
+        <w:tc>
+          <w:tcPr>
+            <w:tcW w:type="dxa" w:w="2160"/>
+          </w:tcPr>
+          <w:p>
+            <w:r>
+              <w:t>no</w:t>
+            </w:r>
+          </w:p>
+        </w:tc>
+        <w:tc>
+          <w:tcPr>
+            <w:tcW w:type="dxa" w:w="2160"/>
+          </w:tcPr>
+          <w:p>
+            <w:r>
+              <w:t>Horizontal centre of the ripple, in pixels.</w:t>
+            </w:r>
+          </w:p>
+        </w:tc>
+      </w:tr>
+      <w:tr>
+        <w:tc>
+          <w:tcPr>
+            <w:tcW w:type="dxa" w:w="2160"/>
+          </w:tcPr>
+          <w:p>
+            <w:r>
+              <w:t>center_y</w:t>
+            </w:r>
+          </w:p>
+        </w:tc>
+        <w:tc>
+          <w:tcPr>
+            <w:tcW w:type="dxa" w:w="2160"/>
+          </w:tcPr>
+          <w:p>
+            <w:r>
+              <w:t>float</w:t>
+            </w:r>
+          </w:p>
+        </w:tc>
+        <w:tc>
+          <w:tcPr>
+            <w:tcW w:type="dxa" w:w="2160"/>
+          </w:tcPr>
+          <w:p>
+            <w:r>
+              <w:t>no</w:t>
+            </w:r>
+          </w:p>
+        </w:tc>
+        <w:tc>
+          <w:tcPr>
+            <w:tcW w:type="dxa" w:w="2160"/>
+          </w:tcPr>
+          <w:p>
+            <w:r>
+              <w:t>Vertical centre of the ripple, in pixels.</w:t>
+            </w:r>
+          </w:p>
+        </w:tc>
+      </w:tr>
+      <w:tr>
+        <w:tc>
+          <w:tcPr>
+            <w:tcW w:type="dxa" w:w="2160"/>
+          </w:tcPr>
+          <w:p>
+            <w:r>
+              <w:t>radius</w:t>
+            </w:r>
+          </w:p>
+        </w:tc>
+        <w:tc>
+          <w:tcPr>
+            <w:tcW w:type="dxa" w:w="2160"/>
+          </w:tcPr>
+          <w:p>
+            <w:r>
+              <w:t>float</w:t>
+            </w:r>
+          </w:p>
+        </w:tc>
+        <w:tc>
+          <w:tcPr>
+            <w:tcW w:type="dxa" w:w="2160"/>
+          </w:tcPr>
+          <w:p>
+            <w:r>
+              <w:t>no</w:t>
+            </w:r>
+          </w:p>
+        </w:tc>
+        <w:tc>
+          <w:tcPr>
+            <w:tcW w:type="dxa" w:w="2160"/>
+          </w:tcPr>
+          <w:p>
+            <w:r>
+              <w:t>Equivalent radius in pixels, (width + height) / 4.</w:t>
+            </w:r>
+          </w:p>
+        </w:tc>
+      </w:tr>
+      <w:tr>
+        <w:tc>
+          <w:tcPr>
+            <w:tcW w:type="dxa" w:w="2160"/>
+          </w:tcPr>
+          <w:p>
+            <w:r>
+              <w:t>width</w:t>
+            </w:r>
+          </w:p>
+        </w:tc>
+        <w:tc>
+          <w:tcPr>
+            <w:tcW w:type="dxa" w:w="2160"/>
+          </w:tcPr>
+          <w:p>
+            <w:r>
+              <w:t>float</w:t>
+            </w:r>
+          </w:p>
+        </w:tc>
+        <w:tc>
+          <w:tcPr>
+            <w:tcW w:type="dxa" w:w="2160"/>
+          </w:tcPr>
+          <w:p>
+            <w:r>
+              <w:t>no</w:t>
+            </w:r>
+          </w:p>
+        </w:tc>
+        <w:tc>
+          <w:tcPr>
+            <w:tcW w:type="dxa" w:w="2160"/>
+          </w:tcPr>
+          <w:p>
+            <w:r>
+              <w:t>Bounding-box width of the ripple, in pixels.</w:t>
+            </w:r>
+          </w:p>
+        </w:tc>
+      </w:tr>
+      <w:tr>
+        <w:tc>
+          <w:tcPr>
+            <w:tcW w:type="dxa" w:w="2160"/>
+          </w:tcPr>
+          <w:p>
+            <w:r>
+              <w:t>height</w:t>
+            </w:r>
+          </w:p>
+        </w:tc>
+        <w:tc>
+          <w:tcPr>
+            <w:tcW w:type="dxa" w:w="2160"/>
+          </w:tcPr>
+          <w:p>
+            <w:r>
+              <w:t>float</w:t>
+            </w:r>
+          </w:p>
+        </w:tc>
+        <w:tc>
+          <w:tcPr>
+            <w:tcW w:type="dxa" w:w="2160"/>
+          </w:tcPr>
+          <w:p>
+            <w:r>
+              <w:t>no</w:t>
+            </w:r>
+          </w:p>
+        </w:tc>
+        <w:tc>
+          <w:tcPr>
+            <w:tcW w:type="dxa" w:w="2160"/>
+          </w:tcPr>
+          <w:p>
+            <w:r>
+              <w:t>Bounding-box height of the ripple, in pixels.</w:t>
+            </w:r>
+          </w:p>
+        </w:tc>
+      </w:tr>
+      <w:tr>
+        <w:tc>
+          <w:tcPr>
+            <w:tcW w:type="dxa" w:w="2160"/>
+          </w:tcPr>
+          <w:p>
+            <w:r>
+              <w:t>confidence</w:t>
+            </w:r>
+          </w:p>
+        </w:tc>
+        <w:tc>
+          <w:tcPr>
+            <w:tcW w:type="dxa" w:w="2160"/>
+          </w:tcPr>
+          <w:p>
+            <w:r>
+              <w:t>float</w:t>
+            </w:r>
+          </w:p>
+        </w:tc>
+        <w:tc>
+          <w:tcPr>
+            <w:tcW w:type="dxa" w:w="2160"/>
+          </w:tcPr>
+          <w:p>
+            <w:r>
+              <w:t>no</w:t>
+            </w:r>
+          </w:p>
+        </w:tc>
+        <w:tc>
+          <w:tcPr>
+            <w:tcW w:type="dxa" w:w="2160"/>
+          </w:tcPr>
+          <w:p>
+            <w:r>
+              <w:t>Detector confidence, between 0.0 and 1.0.</w:t>
+            </w:r>
+          </w:p>
+        </w:tc>
+      </w:tr>
+    </w:tbl>
+    <w:p>
+      <w:pPr>
+        <w:pStyle w:val="Heading2"/>
+      </w:pPr>
+      <w:r>
+        <w:t>DetectionResult</w:t>
+      </w:r>
+    </w:p>
+    <w:p>
+      <w:r>
+        <w:t>Raw detector output for a single image.</w:t>
+      </w:r>
+    </w:p>
+    <w:tbl>
+      <w:tblPr>
+        <w:tblStyle w:val="LightGrid-Accent1"/>
+        <w:tblW w:type="auto" w:w="0"/>
+        <w:tblLook w:firstColumn="1" w:firstRow="1" w:lastColumn="0" w:lastRow="0" w:noHBand="0" w:noVBand="1" w:val="04A0"/>
+      </w:tblPr>
+      <w:tblGrid>
+        <w:gridCol w:w="2160"/>
+        <w:gridCol w:w="2160"/>
+        <w:gridCol w:w="2160"/>
+        <w:gridCol w:w="2160"/>
+      </w:tblGrid>
+      <w:tr>
+        <w:tc>
+          <w:tcPr>
+            <w:tcW w:type="dxa" w:w="2160"/>
+          </w:tcPr>
+          <w:p>
+            <w:r>
+              <w:t>Field</w:t>
+            </w:r>
+          </w:p>
+        </w:tc>
+        <w:tc>
+          <w:tcPr>
+            <w:tcW w:type="dxa" w:w="2160"/>
+          </w:tcPr>
+          <w:p>
+            <w:r>
+              <w:t>Type</w:t>
+            </w:r>
+          </w:p>
+        </w:tc>
+        <w:tc>
+          <w:tcPr>
+            <w:tcW w:type="dxa" w:w="2160"/>
+          </w:tcPr>
+          <w:p>
+            <w:r>
+              <w:t>Nullable</w:t>
+            </w:r>
+          </w:p>
+        </w:tc>
+        <w:tc>
+          <w:tcPr>
+            <w:tcW w:type="dxa" w:w="2160"/>
+          </w:tcPr>
+          <w:p>
+            <w:r>
+              <w:t>Description</w:t>
+            </w:r>
+          </w:p>
+        </w:tc>
+      </w:tr>
+      <w:tr>
+        <w:tc>
+          <w:tcPr>
+            <w:tcW w:type="dxa" w:w="2160"/>
+          </w:tcPr>
+          <w:p>
+            <w:r>
+              <w:t>image_width</w:t>
+            </w:r>
+          </w:p>
+        </w:tc>
+        <w:tc>
+          <w:tcPr>
+            <w:tcW w:type="dxa" w:w="2160"/>
+          </w:tcPr>
+          <w:p>
+            <w:r>
+              <w:t>int</w:t>
+            </w:r>
+          </w:p>
+        </w:tc>
+        <w:tc>
+          <w:tcPr>
+            <w:tcW w:type="dxa" w:w="2160"/>
+          </w:tcPr>
+          <w:p>
+            <w:r>
+              <w:t>no</w:t>
+            </w:r>
+          </w:p>
+        </w:tc>
+        <w:tc>
+          <w:tcPr>
+            <w:tcW w:type="dxa" w:w="2160"/>
+          </w:tcPr>
+          <w:p>
+            <w:r>
+              <w:t>Width of the source image, in pixels.</w:t>
+            </w:r>
+          </w:p>
+        </w:tc>
+      </w:tr>
+      <w:tr>
+        <w:tc>
+          <w:tcPr>
+            <w:tcW w:type="dxa" w:w="2160"/>
+          </w:tcPr>
+          <w:p>
+            <w:r>
+              <w:t>image_height</w:t>
+            </w:r>
+          </w:p>
+        </w:tc>
+        <w:tc>
+          <w:tcPr>
+            <w:tcW w:type="dxa" w:w="2160"/>
+          </w:tcPr>
+          <w:p>
+            <w:r>
+              <w:t>int</w:t>
+            </w:r>
+          </w:p>
+        </w:tc>
+        <w:tc>
+          <w:tcPr>
+            <w:tcW w:type="dxa" w:w="2160"/>
+          </w:tcPr>
+          <w:p>
+            <w:r>
+              <w:t>no</w:t>
+            </w:r>
+          </w:p>
+        </w:tc>
+        <w:tc>
+          <w:tcPr>
+            <w:tcW w:type="dxa" w:w="2160"/>
+          </w:tcPr>
+          <w:p>
+            <w:r>
+              <w:t>Height of the source image, in pixels.</w:t>
+            </w:r>
+          </w:p>
+        </w:tc>
+      </w:tr>
+      <w:tr>
+        <w:tc>
+          <w:tcPr>
+            <w:tcW w:type="dxa" w:w="2160"/>
+          </w:tcPr>
+          <w:p>
+            <w:r>
+              <w:t>ripples</w:t>
+            </w:r>
+          </w:p>
+        </w:tc>
+        <w:tc>
+          <w:tcPr>
+            <w:tcW w:type="dxa" w:w="2160"/>
+          </w:tcPr>
+          <w:p>
+            <w:r>
+              <w:t>tuple[RippleDetection, ...]</w:t>
+            </w:r>
+          </w:p>
+        </w:tc>
+        <w:tc>
+          <w:tcPr>
+            <w:tcW w:type="dxa" w:w="2160"/>
+          </w:tcPr>
+          <w:p>
+            <w:r>
+              <w:t>no</w:t>
+            </w:r>
+          </w:p>
+        </w:tc>
+        <w:tc>
+          <w:tcPr>
+            <w:tcW w:type="dxa" w:w="2160"/>
+          </w:tcPr>
+          <w:p>
+            <w:r>
+              <w:t>The detected ripples, in detector order.</w:t>
+            </w:r>
+          </w:p>
+        </w:tc>
+      </w:tr>
+    </w:tbl>
+    <w:p>
+      <w:pPr>
+        <w:pStyle w:val="Heading2"/>
+      </w:pPr>
+      <w:r>
+        <w:t>RippleAttributes</w:t>
+      </w:r>
+    </w:p>
+    <w:p>
+      <w:r>
+        <w:t>Every ripple measurement extracted from one captured image; the input of the Runge-Kutta key derivation.</w:t>
+      </w:r>
+    </w:p>
+    <w:tbl>
+      <w:tblPr>
+        <w:tblStyle w:val="LightGrid-Accent1"/>
+        <w:tblW w:type="auto" w:w="0"/>
+        <w:tblLook w:firstColumn="1" w:firstRow="1" w:lastColumn="0" w:lastRow="0" w:noHBand="0" w:noVBand="1" w:val="04A0"/>
+      </w:tblPr>
+      <w:tblGrid>
+        <w:gridCol w:w="2160"/>
+        <w:gridCol w:w="2160"/>
+        <w:gridCol w:w="2160"/>
+        <w:gridCol w:w="2160"/>
+      </w:tblGrid>
+      <w:tr>
+        <w:tc>
+          <w:tcPr>
+            <w:tcW w:type="dxa" w:w="2160"/>
+          </w:tcPr>
+          <w:p>
+            <w:r>
+              <w:t>Field</w:t>
+            </w:r>
+          </w:p>
+        </w:tc>
+        <w:tc>
+          <w:tcPr>
+            <w:tcW w:type="dxa" w:w="2160"/>
+          </w:tcPr>
+          <w:p>
+            <w:r>
+              <w:t>Type</w:t>
+            </w:r>
+          </w:p>
+        </w:tc>
+        <w:tc>
+          <w:tcPr>
+            <w:tcW w:type="dxa" w:w="2160"/>
+          </w:tcPr>
+          <w:p>
+            <w:r>
+              <w:t>Nullable</w:t>
+            </w:r>
+          </w:p>
+        </w:tc>
+        <w:tc>
+          <w:tcPr>
+            <w:tcW w:type="dxa" w:w="2160"/>
+          </w:tcPr>
+          <w:p>
+            <w:r>
+              <w:t>Description</w:t>
+            </w:r>
+          </w:p>
+        </w:tc>
+      </w:tr>
+      <w:tr>
+        <w:tc>
+          <w:tcPr>
+            <w:tcW w:type="dxa" w:w="2160"/>
+          </w:tcPr>
+          <w:p>
+            <w:r>
+              <w:t>source_path</w:t>
+            </w:r>
+          </w:p>
+        </w:tc>
+        <w:tc>
+          <w:tcPr>
+            <w:tcW w:type="dxa" w:w="2160"/>
+          </w:tcPr>
+          <w:p>
+            <w:r>
+              <w:t>str</w:t>
+            </w:r>
+          </w:p>
+        </w:tc>
+        <w:tc>
+          <w:tcPr>
+            <w:tcW w:type="dxa" w:w="2160"/>
+          </w:tcPr>
+          <w:p>
+            <w:r>
+              <w:t>no</w:t>
+            </w:r>
+          </w:p>
+        </w:tc>
+        <w:tc>
+          <w:tcPr>
+            <w:tcW w:type="dxa" w:w="2160"/>
+          </w:tcPr>
+          <w:p>
+            <w:r>
+              <w:t>Path of the capture the attributes were extracted from.</w:t>
+            </w:r>
+          </w:p>
+        </w:tc>
+      </w:tr>
+      <w:tr>
+        <w:tc>
+          <w:tcPr>
+            <w:tcW w:type="dxa" w:w="2160"/>
+          </w:tcPr>
+          <w:p>
+            <w:r>
+              <w:t>image_width</w:t>
+            </w:r>
+          </w:p>
+        </w:tc>
+        <w:tc>
+          <w:tcPr>
+            <w:tcW w:type="dxa" w:w="2160"/>
+          </w:tcPr>
+          <w:p>
+            <w:r>
+              <w:t>int</w:t>
+            </w:r>
+          </w:p>
+        </w:tc>
+        <w:tc>
+          <w:tcPr>
+            <w:tcW w:type="dxa" w:w="2160"/>
+          </w:tcPr>
+          <w:p>
+            <w:r>
+              <w:t>no</w:t>
+            </w:r>
+          </w:p>
+        </w:tc>
+        <w:tc>
+          <w:tcPr>
+            <w:tcW w:type="dxa" w:w="2160"/>
+          </w:tcPr>
+          <w:p>
+            <w:r>
+              <w:t>Width of the source image, in pixels.</w:t>
+            </w:r>
+          </w:p>
+        </w:tc>
+      </w:tr>
+      <w:tr>
+        <w:tc>
+          <w:tcPr>
+            <w:tcW w:type="dxa" w:w="2160"/>
+          </w:tcPr>
+          <w:p>
+            <w:r>
+              <w:t>image_height</w:t>
+            </w:r>
+          </w:p>
+        </w:tc>
+        <w:tc>
+          <w:tcPr>
+            <w:tcW w:type="dxa" w:w="2160"/>
+          </w:tcPr>
+          <w:p>
+            <w:r>
+              <w:t>int</w:t>
+            </w:r>
+          </w:p>
+        </w:tc>
+        <w:tc>
+          <w:tcPr>
+            <w:tcW w:type="dxa" w:w="2160"/>
+          </w:tcPr>
+          <w:p>
+            <w:r>
+              <w:t>no</w:t>
+            </w:r>
+          </w:p>
+        </w:tc>
+        <w:tc>
+          <w:tcPr>
+            <w:tcW w:type="dxa" w:w="2160"/>
+          </w:tcPr>
+          <w:p>
+            <w:r>
+              <w:t>Height of the source image, in pixels.</w:t>
+            </w:r>
+          </w:p>
+        </w:tc>
+      </w:tr>
+      <w:tr>
+        <w:tc>
+          <w:tcPr>
+            <w:tcW w:type="dxa" w:w="2160"/>
+          </w:tcPr>
+          <w:p>
+            <w:r>
+              <w:t>detected_at</w:t>
+            </w:r>
+          </w:p>
+        </w:tc>
+        <w:tc>
+          <w:tcPr>
+            <w:tcW w:type="dxa" w:w="2160"/>
+          </w:tcPr>
+          <w:p>
+            <w:r>
+              <w:t>str</w:t>
+            </w:r>
+          </w:p>
+        </w:tc>
+        <w:tc>
+          <w:tcPr>
+            <w:tcW w:type="dxa" w:w="2160"/>
+          </w:tcPr>
+          <w:p>
+            <w:r>
+              <w:t>no</w:t>
+            </w:r>
+          </w:p>
+        </w:tc>
+        <w:tc>
+          <w:tcPr>
+            <w:tcW w:type="dxa" w:w="2160"/>
+          </w:tcPr>
+          <w:p>
+            <w:r>
+              <w:t>ISO 8601 UTC timestamp of the detection.</w:t>
+            </w:r>
+          </w:p>
+        </w:tc>
+      </w:tr>
+      <w:tr>
+        <w:tc>
+          <w:tcPr>
+            <w:tcW w:type="dxa" w:w="2160"/>
+          </w:tcPr>
+          <w:p>
+            <w:r>
+              <w:t>ripples</w:t>
+            </w:r>
+          </w:p>
+        </w:tc>
+        <w:tc>
+          <w:tcPr>
+            <w:tcW w:type="dxa" w:w="2160"/>
+          </w:tcPr>
+          <w:p>
+            <w:r>
+              <w:t>tuple[RippleDetection, ...]</w:t>
+            </w:r>
+          </w:p>
+        </w:tc>
+        <w:tc>
+          <w:tcPr>
+            <w:tcW w:type="dxa" w:w="2160"/>
+          </w:tcPr>
+          <w:p>
+            <w:r>
+              <w:t>no</w:t>
+            </w:r>
+          </w:p>
+        </w:tc>
+        <w:tc>
+          <w:tcPr>
+            <w:tcW w:type="dxa" w:w="2160"/>
+          </w:tcPr>
+          <w:p>
+            <w:r>
+              <w:t>Every ripple detected in the capture.</w:t>
+            </w:r>
+          </w:p>
+        </w:tc>
+      </w:tr>
+      <w:tr>
+        <w:tc>
+          <w:tcPr>
+            <w:tcW w:type="dxa" w:w="2160"/>
+          </w:tcPr>
+          <w:p>
+            <w:r>
+              <w:t>image_id</w:t>
+            </w:r>
+          </w:p>
+        </w:tc>
+        <w:tc>
+          <w:tcPr>
+            <w:tcW w:type="dxa" w:w="2160"/>
+          </w:tcPr>
+          <w:p>
+            <w:r>
+              <w:t>int | None</w:t>
+            </w:r>
+          </w:p>
+        </w:tc>
+        <w:tc>
+          <w:tcPr>
+            <w:tcW w:type="dxa" w:w="2160"/>
+          </w:tcPr>
+          <w:p>
+            <w:r>
+              <w:t>yes</w:t>
+            </w:r>
+          </w:p>
+        </w:tc>
+        <w:tc>
+          <w:tcPr>
+            <w:tcW w:type="dxa" w:w="2160"/>
+          </w:tcPr>
+          <w:p>
+            <w:r>
+              <w:t>Identifier of the stored images row.</w:t>
+            </w:r>
+          </w:p>
+        </w:tc>
+      </w:tr>
+      <w:tr>
+        <w:tc>
+          <w:tcPr>
+            <w:tcW w:type="dxa" w:w="2160"/>
+          </w:tcPr>
+          <w:p>
+            <w:r>
+              <w:t>stored_path</w:t>
+            </w:r>
+          </w:p>
+        </w:tc>
+        <w:tc>
+          <w:tcPr>
+            <w:tcW w:type="dxa" w:w="2160"/>
+          </w:tcPr>
+          <w:p>
+            <w:r>
+              <w:t>str | None</w:t>
+            </w:r>
+          </w:p>
+        </w:tc>
+        <w:tc>
+          <w:tcPr>
+            <w:tcW w:type="dxa" w:w="2160"/>
+          </w:tcPr>
+          <w:p>
+            <w:r>
+              <w:t>yes</w:t>
+            </w:r>
+          </w:p>
+        </w:tc>
+        <w:tc>
+          <w:tcPr>
+            <w:tcW w:type="dxa" w:w="2160"/>
+          </w:tcPr>
+          <w:p>
+            <w:r>
+              <w:t>Path the capture was moved to, when it was archived.</w:t>
+            </w:r>
+          </w:p>
+        </w:tc>
+      </w:tr>
+    </w:tbl>
+    <w:p>
+      <w:pPr>
+        <w:pStyle w:val="Heading2"/>
+      </w:pPr>
+      <w:r>
+        <w:t>ImageOutcome</w:t>
+      </w:r>
+    </w:p>
+    <w:p>
+      <w:r>
+        <w:t>Result of processing a single capture.</w:t>
+      </w:r>
+    </w:p>
+    <w:tbl>
+      <w:tblPr>
+        <w:tblStyle w:val="LightGrid-Accent1"/>
+        <w:tblW w:type="auto" w:w="0"/>
+        <w:tblLook w:firstColumn="1" w:firstRow="1" w:lastColumn="0" w:lastRow="0" w:noHBand="0" w:noVBand="1" w:val="04A0"/>
+      </w:tblPr>
+      <w:tblGrid>
+        <w:gridCol w:w="2160"/>
+        <w:gridCol w:w="2160"/>
+        <w:gridCol w:w="2160"/>
+        <w:gridCol w:w="2160"/>
+      </w:tblGrid>
+      <w:tr>
+        <w:tc>
+          <w:tcPr>
+            <w:tcW w:type="dxa" w:w="2160"/>
+          </w:tcPr>
+          <w:p>
+            <w:r>
+              <w:t>Field</w:t>
+            </w:r>
+          </w:p>
+        </w:tc>
+        <w:tc>
+          <w:tcPr>
+            <w:tcW w:type="dxa" w:w="2160"/>
+          </w:tcPr>
+          <w:p>
+            <w:r>
+              <w:t>Type</w:t>
+            </w:r>
+          </w:p>
+        </w:tc>
+        <w:tc>
+          <w:tcPr>
+            <w:tcW w:type="dxa" w:w="2160"/>
+          </w:tcPr>
+          <w:p>
+            <w:r>
+              <w:t>Nullable</w:t>
+            </w:r>
+          </w:p>
+        </w:tc>
+        <w:tc>
+          <w:tcPr>
+            <w:tcW w:type="dxa" w:w="2160"/>
+          </w:tcPr>
+          <w:p>
+            <w:r>
+              <w:t>Description</w:t>
+            </w:r>
+          </w:p>
+        </w:tc>
+      </w:tr>
+      <w:tr>
+        <w:tc>
+          <w:tcPr>
+            <w:tcW w:type="dxa" w:w="2160"/>
+          </w:tcPr>
+          <w:p>
+            <w:r>
+              <w:t>source</w:t>
+            </w:r>
+          </w:p>
+        </w:tc>
+        <w:tc>
+          <w:tcPr>
+            <w:tcW w:type="dxa" w:w="2160"/>
+          </w:tcPr>
+          <w:p>
+            <w:r>
+              <w:t>str</w:t>
+            </w:r>
+          </w:p>
+        </w:tc>
+        <w:tc>
+          <w:tcPr>
+            <w:tcW w:type="dxa" w:w="2160"/>
+          </w:tcPr>
+          <w:p>
+            <w:r>
+              <w:t>no</w:t>
+            </w:r>
+          </w:p>
+        </w:tc>
+        <w:tc>
+          <w:tcPr>
+            <w:tcW w:type="dxa" w:w="2160"/>
+          </w:tcPr>
+          <w:p>
+            <w:r>
+              <w:t>Path of the capture that was processed.</w:t>
+            </w:r>
+          </w:p>
+        </w:tc>
+      </w:tr>
+      <w:tr>
+        <w:tc>
+          <w:tcPr>
+            <w:tcW w:type="dxa" w:w="2160"/>
+          </w:tcPr>
+          <w:p>
+            <w:r>
+              <w:t>status</w:t>
+            </w:r>
+          </w:p>
+        </w:tc>
+        <w:tc>
+          <w:tcPr>
+            <w:tcW w:type="dxa" w:w="2160"/>
+          </w:tcPr>
+          <w:p>
+            <w:r>
+              <w:t>str</w:t>
+            </w:r>
+          </w:p>
+        </w:tc>
+        <w:tc>
+          <w:tcPr>
+            <w:tcW w:type="dxa" w:w="2160"/>
+          </w:tcPr>
+          <w:p>
+            <w:r>
+              <w:t>no</w:t>
+            </w:r>
+          </w:p>
+        </w:tc>
+        <w:tc>
+          <w:tcPr>
+            <w:tcW w:type="dxa" w:w="2160"/>
+          </w:tcPr>
+          <w:p>
+            <w:r>
+              <w:t>One of processed, no_features or error.</w:t>
+            </w:r>
+          </w:p>
+        </w:tc>
+      </w:tr>
+      <w:tr>
+        <w:tc>
+          <w:tcPr>
+            <w:tcW w:type="dxa" w:w="2160"/>
+          </w:tcPr>
+          <w:p>
+            <w:r>
+              <w:t>image_id</w:t>
+            </w:r>
+          </w:p>
+        </w:tc>
+        <w:tc>
+          <w:tcPr>
+            <w:tcW w:type="dxa" w:w="2160"/>
+          </w:tcPr>
+          <w:p>
+            <w:r>
+              <w:t>int | None</w:t>
+            </w:r>
+          </w:p>
+        </w:tc>
+        <w:tc>
+          <w:tcPr>
+            <w:tcW w:type="dxa" w:w="2160"/>
+          </w:tcPr>
+          <w:p>
+            <w:r>
+              <w:t>yes</w:t>
+            </w:r>
+          </w:p>
+        </w:tc>
+        <w:tc>
+          <w:tcPr>
+            <w:tcW w:type="dxa" w:w="2160"/>
+          </w:tcPr>
+          <w:p>
+            <w:r>
+              <w:t>Identifier of the stored images row.</w:t>
+            </w:r>
+          </w:p>
+        </w:tc>
+      </w:tr>
+      <w:tr>
+        <w:tc>
+          <w:tcPr>
+            <w:tcW w:type="dxa" w:w="2160"/>
+          </w:tcPr>
+          <w:p>
+            <w:r>
+              <w:t>ripple_count</w:t>
+            </w:r>
+          </w:p>
+        </w:tc>
+        <w:tc>
+          <w:tcPr>
+            <w:tcW w:type="dxa" w:w="2160"/>
+          </w:tcPr>
+          <w:p>
+            <w:r>
+              <w:t>int</w:t>
+            </w:r>
+          </w:p>
+        </w:tc>
+        <w:tc>
+          <w:tcPr>
+            <w:tcW w:type="dxa" w:w="2160"/>
+          </w:tcPr>
+          <w:p>
+            <w:r>
+              <w:t>no</w:t>
+            </w:r>
+          </w:p>
+        </w:tc>
+        <w:tc>
+          <w:tcPr>
+            <w:tcW w:type="dxa" w:w="2160"/>
+          </w:tcPr>
+          <w:p>
+            <w:r>
+              <w:t>Number of detected ripples.</w:t>
+            </w:r>
+          </w:p>
+        </w:tc>
+      </w:tr>
+      <w:tr>
+        <w:tc>
+          <w:tcPr>
+            <w:tcW w:type="dxa" w:w="2160"/>
+          </w:tcPr>
+          <w:p>
+            <w:r>
+              <w:t>features_path</w:t>
+            </w:r>
+          </w:p>
+        </w:tc>
+        <w:tc>
+          <w:tcPr>
+            <w:tcW w:type="dxa" w:w="2160"/>
+          </w:tcPr>
+          <w:p>
+            <w:r>
+              <w:t>str | None</w:t>
+            </w:r>
+          </w:p>
+        </w:tc>
+        <w:tc>
+          <w:tcPr>
+            <w:tcW w:type="dxa" w:w="2160"/>
+          </w:tcPr>
+          <w:p>
+            <w:r>
+              <w:t>yes</w:t>
+            </w:r>
+          </w:p>
+        </w:tc>
+        <w:tc>
+          <w:tcPr>
+            <w:tcW w:type="dxa" w:w="2160"/>
+          </w:tcPr>
+          <w:p>
+            <w:r>
+              <w:t>Path of the JSON attribute document.</w:t>
+            </w:r>
+          </w:p>
+        </w:tc>
+      </w:tr>
+      <w:tr>
+        <w:tc>
+          <w:tcPr>
+            <w:tcW w:type="dxa" w:w="2160"/>
+          </w:tcPr>
+          <w:p>
+            <w:r>
+              <w:t>stored_path</w:t>
+            </w:r>
+          </w:p>
+        </w:tc>
+        <w:tc>
+          <w:tcPr>
+            <w:tcW w:type="dxa" w:w="2160"/>
+          </w:tcPr>
+          <w:p>
+            <w:r>
+              <w:t>str | None</w:t>
+            </w:r>
+          </w:p>
+        </w:tc>
+        <w:tc>
+          <w:tcPr>
+            <w:tcW w:type="dxa" w:w="2160"/>
+          </w:tcPr>
+          <w:p>
+            <w:r>
+              <w:t>yes</w:t>
+            </w:r>
+          </w:p>
+        </w:tc>
+        <w:tc>
+          <w:tcPr>
+            <w:tcW w:type="dxa" w:w="2160"/>
+          </w:tcPr>
+          <w:p>
+            <w:r>
+              <w:t>Path the capture was moved to.</w:t>
+            </w:r>
+          </w:p>
+        </w:tc>
+      </w:tr>
+      <w:tr>
+        <w:tc>
+          <w:tcPr>
+            <w:tcW w:type="dxa" w:w="2160"/>
+          </w:tcPr>
+          <w:p>
+            <w:r>
+              <w:t>error</w:t>
+            </w:r>
+          </w:p>
+        </w:tc>
+        <w:tc>
+          <w:tcPr>
+            <w:tcW w:type="dxa" w:w="2160"/>
+          </w:tcPr>
+          <w:p>
+            <w:r>
+              <w:t>str | None</w:t>
+            </w:r>
+          </w:p>
+        </w:tc>
+        <w:tc>
+          <w:tcPr>
+            <w:tcW w:type="dxa" w:w="2160"/>
+          </w:tcPr>
+          <w:p>
+            <w:r>
+              <w:t>yes</w:t>
+            </w:r>
+          </w:p>
+        </w:tc>
+        <w:tc>
+          <w:tcPr>
+            <w:tcW w:type="dxa" w:w="2160"/>
+          </w:tcPr>
+          <w:p>
+            <w:r>
+              <w:t>Error message; set only for the error status.</w:t>
+            </w:r>
+          </w:p>
+        </w:tc>
+      </w:tr>
+    </w:tbl>
+    <w:p>
+      <w:pPr>
+        <w:pStyle w:val="Heading2"/>
+      </w:pPr>
+      <w:r>
+        <w:t>MasterKey</w:t>
+      </w:r>
+    </w:p>
+    <w:p>
+      <w:r>
+        <w:t>Experimental master key derived from the averaged ripple attributes of one capture.</w:t>
+      </w:r>
+    </w:p>
+    <w:tbl>
+      <w:tblPr>
+        <w:tblStyle w:val="LightGrid-Accent1"/>
+        <w:tblW w:type="auto" w:w="0"/>
+        <w:tblLook w:firstColumn="1" w:firstRow="1" w:lastColumn="0" w:lastRow="0" w:noHBand="0" w:noVBand="1" w:val="04A0"/>
+      </w:tblPr>
+      <w:tblGrid>
+        <w:gridCol w:w="2160"/>
+        <w:gridCol w:w="2160"/>
+        <w:gridCol w:w="2160"/>
+        <w:gridCol w:w="2160"/>
+      </w:tblGrid>
+      <w:tr>
+        <w:tc>
+          <w:tcPr>
+            <w:tcW w:type="dxa" w:w="2160"/>
+          </w:tcPr>
+          <w:p>
+            <w:r>
+              <w:t>Field</w:t>
+            </w:r>
+          </w:p>
+        </w:tc>
+        <w:tc>
+          <w:tcPr>
+            <w:tcW w:type="dxa" w:w="2160"/>
+          </w:tcPr>
+          <w:p>
+            <w:r>
+              <w:t>Type</w:t>
+            </w:r>
+          </w:p>
+        </w:tc>
+        <w:tc>
+          <w:tcPr>
+            <w:tcW w:type="dxa" w:w="2160"/>
+          </w:tcPr>
+          <w:p>
+            <w:r>
+              <w:t>Nullable</w:t>
+            </w:r>
+          </w:p>
+        </w:tc>
+        <w:tc>
+          <w:tcPr>
+            <w:tcW w:type="dxa" w:w="2160"/>
+          </w:tcPr>
+          <w:p>
+            <w:r>
+              <w:t>Description</w:t>
+            </w:r>
+          </w:p>
+        </w:tc>
+      </w:tr>
+      <w:tr>
+        <w:tc>
+          <w:tcPr>
+            <w:tcW w:type="dxa" w:w="2160"/>
+          </w:tcPr>
+          <w:p>
+            <w:r>
+              <w:t>image_id</w:t>
+            </w:r>
+          </w:p>
+        </w:tc>
+        <w:tc>
+          <w:tcPr>
+            <w:tcW w:type="dxa" w:w="2160"/>
+          </w:tcPr>
+          <w:p>
+            <w:r>
+              <w:t>int</w:t>
+            </w:r>
+          </w:p>
+        </w:tc>
+        <w:tc>
+          <w:tcPr>
+            <w:tcW w:type="dxa" w:w="2160"/>
+          </w:tcPr>
+          <w:p>
+            <w:r>
+              <w:t>no</w:t>
+            </w:r>
+          </w:p>
+        </w:tc>
+        <w:tc>
+          <w:tcPr>
+            <w:tcW w:type="dxa" w:w="2160"/>
+          </w:tcPr>
+          <w:p>
+            <w:r>
+              <w:t>Identifier of the capture the key belongs to.</w:t>
+            </w:r>
+          </w:p>
+        </w:tc>
+      </w:tr>
+      <w:tr>
+        <w:tc>
+          <w:tcPr>
+            <w:tcW w:type="dxa" w:w="2160"/>
+          </w:tcPr>
+          <w:p>
+            <w:r>
+              <w:t>key</w:t>
+            </w:r>
+          </w:p>
+        </w:tc>
+        <w:tc>
+          <w:tcPr>
+            <w:tcW w:type="dxa" w:w="2160"/>
+          </w:tcPr>
+          <w:p>
+            <w:r>
+              <w:t>str</w:t>
+            </w:r>
+          </w:p>
+        </w:tc>
+        <w:tc>
+          <w:tcPr>
+            <w:tcW w:type="dxa" w:w="2160"/>
+          </w:tcPr>
+          <w:p>
+            <w:r>
+              <w:t>no</w:t>
+            </w:r>
+          </w:p>
+        </w:tc>
+        <w:tc>
+          <w:tcPr>
+            <w:tcW w:type="dxa" w:w="2160"/>
+          </w:tcPr>
+          <w:p>
+            <w:r>
+              <w:t>Hex-encoded research artifact (not a production key).</w:t>
+            </w:r>
+          </w:p>
+        </w:tc>
+      </w:tr>
+      <w:tr>
+        <w:tc>
+          <w:tcPr>
+            <w:tcW w:type="dxa" w:w="2160"/>
+          </w:tcPr>
+          <w:p>
+            <w:r>
+              <w:t>bits</w:t>
+            </w:r>
+          </w:p>
+        </w:tc>
+        <w:tc>
+          <w:tcPr>
+            <w:tcW w:type="dxa" w:w="2160"/>
+          </w:tcPr>
+          <w:p>
+            <w:r>
+              <w:t>int</w:t>
+            </w:r>
+          </w:p>
+        </w:tc>
+        <w:tc>
+          <w:tcPr>
+            <w:tcW w:type="dxa" w:w="2160"/>
+          </w:tcPr>
+          <w:p>
+            <w:r>
+              <w:t>no</w:t>
+            </w:r>
+          </w:p>
+        </w:tc>
+        <w:tc>
+          <w:tcPr>
+            <w:tcW w:type="dxa" w:w="2160"/>
+          </w:tcPr>
+          <w:p>
+            <w:r>
+              <w:t>Size of the artifact in bits (32 or 64).</w:t>
+            </w:r>
+          </w:p>
+        </w:tc>
+      </w:tr>
+      <w:tr>
+        <w:tc>
+          <w:tcPr>
+            <w:tcW w:type="dxa" w:w="2160"/>
+          </w:tcPr>
+          <w:p>
+            <w:r>
+              <w:t>algorithm</w:t>
+            </w:r>
+          </w:p>
+        </w:tc>
+        <w:tc>
+          <w:tcPr>
+            <w:tcW w:type="dxa" w:w="2160"/>
+          </w:tcPr>
+          <w:p>
+            <w:r>
+              <w:t>str</w:t>
+            </w:r>
+          </w:p>
+        </w:tc>
+        <w:tc>
+          <w:tcPr>
+            <w:tcW w:type="dxa" w:w="2160"/>
+          </w:tcPr>
+          <w:p>
+            <w:r>
+              <w:t>no</w:t>
+            </w:r>
+          </w:p>
+        </w:tc>
+        <w:tc>
+          <w:tcPr>
+            <w:tcW w:type="dxa" w:w="2160"/>
+          </w:tcPr>
+          <w:p>
+            <w:r>
+              <w:t>Identifier of the derivation procedure.</w:t>
+            </w:r>
+          </w:p>
+        </w:tc>
+      </w:tr>
+      <w:tr>
+        <w:tc>
+          <w:tcPr>
+            <w:tcW w:type="dxa" w:w="2160"/>
+          </w:tcPr>
+          <w:p>
+            <w:r>
+              <w:t>parameters</w:t>
+            </w:r>
+          </w:p>
+        </w:tc>
+        <w:tc>
+          <w:tcPr>
+            <w:tcW w:type="dxa" w:w="2160"/>
+          </w:tcPr>
+          <w:p>
+            <w:r>
+              <w:t>dict[str, float]</w:t>
+            </w:r>
+          </w:p>
+        </w:tc>
+        <w:tc>
+          <w:tcPr>
+            <w:tcW w:type="dxa" w:w="2160"/>
+          </w:tcPr>
+          <w:p>
+            <w:r>
+              <w:t>no</w:t>
+            </w:r>
+          </w:p>
+        </w:tc>
+        <w:tc>
+          <w:tcPr>
+            <w:tcW w:type="dxa" w:w="2160"/>
+          </w:tcPr>
+          <w:p>
+            <w:r>
+              <w:t>Averaged attributes and ODE parameters used for the derivation.</w:t>
+            </w:r>
+          </w:p>
+        </w:tc>
+      </w:tr>
+      <w:tr>
+        <w:tc>
+          <w:tcPr>
+            <w:tcW w:type="dxa" w:w="2160"/>
+          </w:tcPr>
+          <w:p>
+            <w:r>
+              <w:t>derived_at</w:t>
+            </w:r>
+          </w:p>
+        </w:tc>
+        <w:tc>
+          <w:tcPr>
+            <w:tcW w:type="dxa" w:w="2160"/>
+          </w:tcPr>
+          <w:p>
+            <w:r>
+              <w:t>str</w:t>
+            </w:r>
+          </w:p>
+        </w:tc>
+        <w:tc>
+          <w:tcPr>
+            <w:tcW w:type="dxa" w:w="2160"/>
+          </w:tcPr>
+          <w:p>
+            <w:r>
+              <w:t>no</w:t>
+            </w:r>
+          </w:p>
+        </w:tc>
+        <w:tc>
+          <w:tcPr>
+            <w:tcW w:type="dxa" w:w="2160"/>
+          </w:tcPr>
+          <w:p>
+            <w:r>
+              <w:t>ISO 8601 UTC timestamp of the derivation.</w:t>
+            </w:r>
+          </w:p>
+        </w:tc>
+      </w:tr>
+    </w:tbl>
+    <w:p>
+      <w:pPr>
+        <w:pStyle w:val="Heading2"/>
+      </w:pPr>
+      <w:r>
+        <w:t>SlaveKey</w:t>
+      </w:r>
+    </w:p>
+    <w:p>
+      <w:r>
+        <w:t>Experimental slave key, derived from a single ripple and bound to exactly one master key.</w:t>
+      </w:r>
+    </w:p>
+    <w:tbl>
+      <w:tblPr>
+        <w:tblStyle w:val="LightGrid-Accent1"/>
+        <w:tblW w:type="auto" w:w="0"/>
+        <w:tblLook w:firstColumn="1" w:firstRow="1" w:lastColumn="0" w:lastRow="0" w:noHBand="0" w:noVBand="1" w:val="04A0"/>
+      </w:tblPr>
+      <w:tblGrid>
+        <w:gridCol w:w="2160"/>
+        <w:gridCol w:w="2160"/>
+        <w:gridCol w:w="2160"/>
+        <w:gridCol w:w="2160"/>
+      </w:tblGrid>
+      <w:tr>
+        <w:tc>
+          <w:tcPr>
+            <w:tcW w:type="dxa" w:w="2160"/>
+          </w:tcPr>
+          <w:p>
+            <w:r>
+              <w:t>Field</w:t>
+            </w:r>
+          </w:p>
+        </w:tc>
+        <w:tc>
+          <w:tcPr>
+            <w:tcW w:type="dxa" w:w="2160"/>
+          </w:tcPr>
+          <w:p>
+            <w:r>
+              <w:t>Type</w:t>
+            </w:r>
+          </w:p>
+        </w:tc>
+        <w:tc>
+          <w:tcPr>
+            <w:tcW w:type="dxa" w:w="2160"/>
+          </w:tcPr>
+          <w:p>
+            <w:r>
+              <w:t>Nullable</w:t>
+            </w:r>
+          </w:p>
+        </w:tc>
+        <w:tc>
+          <w:tcPr>
+            <w:tcW w:type="dxa" w:w="2160"/>
+          </w:tcPr>
+          <w:p>
+            <w:r>
+              <w:t>Description</w:t>
+            </w:r>
+          </w:p>
+        </w:tc>
+      </w:tr>
+      <w:tr>
+        <w:tc>
+          <w:tcPr>
+            <w:tcW w:type="dxa" w:w="2160"/>
+          </w:tcPr>
+          <w:p>
+            <w:r>
+              <w:t>master_key_id</w:t>
+            </w:r>
+          </w:p>
+        </w:tc>
+        <w:tc>
+          <w:tcPr>
+            <w:tcW w:type="dxa" w:w="2160"/>
+          </w:tcPr>
+          <w:p>
+            <w:r>
+              <w:t>int</w:t>
+            </w:r>
+          </w:p>
+        </w:tc>
+        <w:tc>
+          <w:tcPr>
+            <w:tcW w:type="dxa" w:w="2160"/>
+          </w:tcPr>
+          <w:p>
+            <w:r>
+              <w:t>no</w:t>
+            </w:r>
+          </w:p>
+        </w:tc>
+        <w:tc>
+          <w:tcPr>
+            <w:tcW w:type="dxa" w:w="2160"/>
+          </w:tcPr>
+          <w:p>
+            <w:r>
+              <w:t>Identifier of the master key this key belongs to.</w:t>
+            </w:r>
+          </w:p>
+        </w:tc>
+      </w:tr>
+      <w:tr>
+        <w:tc>
+          <w:tcPr>
+            <w:tcW w:type="dxa" w:w="2160"/>
+          </w:tcPr>
+          <w:p>
+            <w:r>
+              <w:t>image_id</w:t>
+            </w:r>
+          </w:p>
+        </w:tc>
+        <w:tc>
+          <w:tcPr>
+            <w:tcW w:type="dxa" w:w="2160"/>
+          </w:tcPr>
+          <w:p>
+            <w:r>
+              <w:t>int</w:t>
+            </w:r>
+          </w:p>
+        </w:tc>
+        <w:tc>
+          <w:tcPr>
+            <w:tcW w:type="dxa" w:w="2160"/>
+          </w:tcPr>
+          <w:p>
+            <w:r>
+              <w:t>no</w:t>
+            </w:r>
+          </w:p>
+        </w:tc>
+        <w:tc>
+          <w:tcPr>
+            <w:tcW w:type="dxa" w:w="2160"/>
+          </w:tcPr>
+          <w:p>
+            <w:r>
+              <w:t>Identifier of the capture the key belongs to.</w:t>
+            </w:r>
+          </w:p>
+        </w:tc>
+      </w:tr>
+      <w:tr>
+        <w:tc>
+          <w:tcPr>
+            <w:tcW w:type="dxa" w:w="2160"/>
+          </w:tcPr>
+          <w:p>
+            <w:r>
+              <w:t>ripple_index</w:t>
+            </w:r>
+          </w:p>
+        </w:tc>
+        <w:tc>
+          <w:tcPr>
+            <w:tcW w:type="dxa" w:w="2160"/>
+          </w:tcPr>
+          <w:p>
+            <w:r>
+              <w:t>int</w:t>
+            </w:r>
+          </w:p>
+        </w:tc>
+        <w:tc>
+          <w:tcPr>
+            <w:tcW w:type="dxa" w:w="2160"/>
+          </w:tcPr>
+          <w:p>
+            <w:r>
+              <w:t>no</w:t>
+            </w:r>
+          </w:p>
+        </w:tc>
+        <w:tc>
+          <w:tcPr>
+            <w:tcW w:type="dxa" w:w="2160"/>
+          </w:tcPr>
+          <w:p>
+            <w:r>
+              <w:t>Index of the ripple the key was derived from.</w:t>
+            </w:r>
+          </w:p>
+        </w:tc>
+      </w:tr>
+      <w:tr>
+        <w:tc>
+          <w:tcPr>
+            <w:tcW w:type="dxa" w:w="2160"/>
+          </w:tcPr>
+          <w:p>
+            <w:r>
+              <w:t>key</w:t>
+            </w:r>
+          </w:p>
+        </w:tc>
+        <w:tc>
+          <w:tcPr>
+            <w:tcW w:type="dxa" w:w="2160"/>
+          </w:tcPr>
+          <w:p>
+            <w:r>
+              <w:t>str</w:t>
+            </w:r>
+          </w:p>
+        </w:tc>
+        <w:tc>
+          <w:tcPr>
+            <w:tcW w:type="dxa" w:w="2160"/>
+          </w:tcPr>
+          <w:p>
+            <w:r>
+              <w:t>no</w:t>
+            </w:r>
+          </w:p>
+        </w:tc>
+        <w:tc>
+          <w:tcPr>
+            <w:tcW w:type="dxa" w:w="2160"/>
+          </w:tcPr>
+          <w:p>
+            <w:r>
+              <w:t>Hex-encoded research artifact (not a production key).</w:t>
+            </w:r>
+          </w:p>
+        </w:tc>
+      </w:tr>
+      <w:tr>
+        <w:tc>
+          <w:tcPr>
+            <w:tcW w:type="dxa" w:w="2160"/>
+          </w:tcPr>
+          <w:p>
+            <w:r>
+              <w:t>bits</w:t>
+            </w:r>
+          </w:p>
+        </w:tc>
+        <w:tc>
+          <w:tcPr>
+            <w:tcW w:type="dxa" w:w="2160"/>
+          </w:tcPr>
+          <w:p>
+            <w:r>
+              <w:t>int</w:t>
+            </w:r>
+          </w:p>
+        </w:tc>
+        <w:tc>
+          <w:tcPr>
+            <w:tcW w:type="dxa" w:w="2160"/>
+          </w:tcPr>
+          <w:p>
+            <w:r>
+              <w:t>no</w:t>
+            </w:r>
+          </w:p>
+        </w:tc>
+        <w:tc>
+          <w:tcPr>
+            <w:tcW w:type="dxa" w:w="2160"/>
+          </w:tcPr>
+          <w:p>
+            <w:r>
+              <w:t>Size of the artifact in bits (32 or 64).</w:t>
+            </w:r>
+          </w:p>
+        </w:tc>
+      </w:tr>
+      <w:tr>
+        <w:tc>
+          <w:tcPr>
+            <w:tcW w:type="dxa" w:w="2160"/>
+          </w:tcPr>
+          <w:p>
+            <w:r>
+              <w:t>algorithm</w:t>
+            </w:r>
+          </w:p>
+        </w:tc>
+        <w:tc>
+          <w:tcPr>
+            <w:tcW w:type="dxa" w:w="2160"/>
+          </w:tcPr>
+          <w:p>
+            <w:r>
+              <w:t>str</w:t>
+            </w:r>
+          </w:p>
+        </w:tc>
+        <w:tc>
+          <w:tcPr>
+            <w:tcW w:type="dxa" w:w="2160"/>
+          </w:tcPr>
+          <w:p>
+            <w:r>
+              <w:t>no</w:t>
+            </w:r>
+          </w:p>
+        </w:tc>
+        <w:tc>
+          <w:tcPr>
+            <w:tcW w:type="dxa" w:w="2160"/>
+          </w:tcPr>
+          <w:p>
+            <w:r>
+              <w:t>Identifier of the derivation procedure and of the binding.</w:t>
+            </w:r>
+          </w:p>
+        </w:tc>
+      </w:tr>
+      <w:tr>
+        <w:tc>
+          <w:tcPr>
+            <w:tcW w:type="dxa" w:w="2160"/>
+          </w:tcPr>
+          <w:p>
+            <w:r>
+              <w:t>derived_at</w:t>
+            </w:r>
+          </w:p>
+        </w:tc>
+        <w:tc>
+          <w:tcPr>
+            <w:tcW w:type="dxa" w:w="2160"/>
+          </w:tcPr>
+          <w:p>
+            <w:r>
+              <w:t>str</w:t>
+            </w:r>
+          </w:p>
+        </w:tc>
+        <w:tc>
+          <w:tcPr>
+            <w:tcW w:type="dxa" w:w="2160"/>
+          </w:tcPr>
+          <w:p>
+            <w:r>
+              <w:t>no</w:t>
+            </w:r>
+          </w:p>
+        </w:tc>
+        <w:tc>
+          <w:tcPr>
+            <w:tcW w:type="dxa" w:w="2160"/>
+          </w:tcPr>
+          <w:p>
+            <w:r>
+              <w:t>ISO 8601 UTC timestamp of the derivation.</w:t>
+            </w:r>
+          </w:p>
+        </w:tc>
+      </w:tr>
+    </w:tbl>
+    <w:p>
+      <w:pPr>
+        <w:pStyle w:val="Heading2"/>
+      </w:pPr>
+      <w:r>
+        <w:t>RippleWaveParameters</w:t>
+      </w:r>
+    </w:p>
+    <w:p>
+      <w:r>
+        <w:t>Parameters of the coupled van der Pol oscillator system that the Runge-Kutta integration uses.</w:t>
+      </w:r>
+    </w:p>
+    <w:tbl>
+      <w:tblPr>
+        <w:tblStyle w:val="LightGrid-Accent1"/>
+        <w:tblW w:type="auto" w:w="0"/>
+        <w:tblLook w:firstColumn="1" w:firstRow="1" w:lastColumn="0" w:lastRow="0" w:noHBand="0" w:noVBand="1" w:val="04A0"/>
+      </w:tblPr>
+      <w:tblGrid>
+        <w:gridCol w:w="2160"/>
+        <w:gridCol w:w="2160"/>
+        <w:gridCol w:w="2160"/>
+        <w:gridCol w:w="2160"/>
+      </w:tblGrid>
+      <w:tr>
+        <w:tc>
+          <w:tcPr>
+            <w:tcW w:type="dxa" w:w="2160"/>
+          </w:tcPr>
+          <w:p>
+            <w:r>
+              <w:t>Field</w:t>
+            </w:r>
+          </w:p>
+        </w:tc>
+        <w:tc>
+          <w:tcPr>
+            <w:tcW w:type="dxa" w:w="2160"/>
+          </w:tcPr>
+          <w:p>
+            <w:r>
+              <w:t>Type</w:t>
+            </w:r>
+          </w:p>
+        </w:tc>
+        <w:tc>
+          <w:tcPr>
+            <w:tcW w:type="dxa" w:w="2160"/>
+          </w:tcPr>
+          <w:p>
+            <w:r>
+              <w:t>Nullable</w:t>
+            </w:r>
+          </w:p>
+        </w:tc>
+        <w:tc>
+          <w:tcPr>
+            <w:tcW w:type="dxa" w:w="2160"/>
+          </w:tcPr>
+          <w:p>
+            <w:r>
+              <w:t>Description</w:t>
+            </w:r>
+          </w:p>
+        </w:tc>
+      </w:tr>
+      <w:tr>
+        <w:tc>
+          <w:tcPr>
+            <w:tcW w:type="dxa" w:w="2160"/>
+          </w:tcPr>
+          <w:p>
+            <w:r>
+              <w:t>mu</w:t>
+            </w:r>
+          </w:p>
+        </w:tc>
+        <w:tc>
+          <w:tcPr>
+            <w:tcW w:type="dxa" w:w="2160"/>
+          </w:tcPr>
+          <w:p>
+            <w:r>
+              <w:t>float</w:t>
+            </w:r>
+          </w:p>
+        </w:tc>
+        <w:tc>
+          <w:tcPr>
+            <w:tcW w:type="dxa" w:w="2160"/>
+          </w:tcPr>
+          <w:p>
+            <w:r>
+              <w:t>no</w:t>
+            </w:r>
+          </w:p>
+        </w:tc>
+        <w:tc>
+          <w:tcPr>
+            <w:tcW w:type="dxa" w:w="2160"/>
+          </w:tcPr>
+          <w:p>
+            <w:r>
+              <w:t>Nonlinearity (van der Pol damping) of both oscillators.</w:t>
+            </w:r>
+          </w:p>
+        </w:tc>
+      </w:tr>
+      <w:tr>
+        <w:tc>
+          <w:tcPr>
+            <w:tcW w:type="dxa" w:w="2160"/>
+          </w:tcPr>
+          <w:p>
+            <w:r>
+              <w:t>coupling</w:t>
+            </w:r>
+          </w:p>
+        </w:tc>
+        <w:tc>
+          <w:tcPr>
+            <w:tcW w:type="dxa" w:w="2160"/>
+          </w:tcPr>
+          <w:p>
+            <w:r>
+              <w:t>float</w:t>
+            </w:r>
+          </w:p>
+        </w:tc>
+        <w:tc>
+          <w:tcPr>
+            <w:tcW w:type="dxa" w:w="2160"/>
+          </w:tcPr>
+          <w:p>
+            <w:r>
+              <w:t>no</w:t>
+            </w:r>
+          </w:p>
+        </w:tc>
+        <w:tc>
+          <w:tcPr>
+            <w:tcW w:type="dxa" w:w="2160"/>
+          </w:tcPr>
+          <w:p>
+            <w:r>
+              <w:t>Coupling strength between the two oscillators.</w:t>
+            </w:r>
+          </w:p>
+        </w:tc>
+      </w:tr>
+      <w:tr>
+        <w:tc>
+          <w:tcPr>
+            <w:tcW w:type="dxa" w:w="2160"/>
+          </w:tcPr>
+          <w:p>
+            <w:r>
+              <w:t>forcing</w:t>
+            </w:r>
+          </w:p>
+        </w:tc>
+        <w:tc>
+          <w:tcPr>
+            <w:tcW w:type="dxa" w:w="2160"/>
+          </w:tcPr>
+          <w:p>
+            <w:r>
+              <w:t>float</w:t>
+            </w:r>
+          </w:p>
+        </w:tc>
+        <w:tc>
+          <w:tcPr>
+            <w:tcW w:type="dxa" w:w="2160"/>
+          </w:tcPr>
+          <w:p>
+            <w:r>
+              <w:t>no</w:t>
+            </w:r>
+          </w:p>
+        </w:tc>
+        <w:tc>
+          <w:tcPr>
+            <w:tcW w:type="dxa" w:w="2160"/>
+          </w:tcPr>
+          <w:p>
+            <w:r>
+              <w:t>Amplitude of the periodic forcing term.</w:t>
+            </w:r>
+          </w:p>
+        </w:tc>
+      </w:tr>
+      <w:tr>
+        <w:tc>
+          <w:tcPr>
+            <w:tcW w:type="dxa" w:w="2160"/>
+          </w:tcPr>
+          <w:p>
+            <w:r>
+              <w:t>phase</w:t>
+            </w:r>
+          </w:p>
+        </w:tc>
+        <w:tc>
+          <w:tcPr>
+            <w:tcW w:type="dxa" w:w="2160"/>
+          </w:tcPr>
+          <w:p>
+            <w:r>
+              <w:t>float</w:t>
+            </w:r>
+          </w:p>
+        </w:tc>
+        <w:tc>
+          <w:tcPr>
+            <w:tcW w:type="dxa" w:w="2160"/>
+          </w:tcPr>
+          <w:p>
+            <w:r>
+              <w:t>no</w:t>
+            </w:r>
+          </w:p>
+        </w:tc>
+        <w:tc>
+          <w:tcPr>
+            <w:tcW w:type="dxa" w:w="2160"/>
+          </w:tcPr>
+          <w:p>
+            <w:r>
+              <w:t>Phase of the forcing term, in radians.</w:t>
+            </w:r>
+          </w:p>
+        </w:tc>
+      </w:tr>
+    </w:tbl>
+    <w:p>
+      <w:pPr>
+        <w:pStyle w:val="Heading1"/>
+      </w:pPr>
+      <w:r>
+        <w:t>8. Data flow and storage layout</w:t>
+      </w:r>
+    </w:p>
+    <w:p>
+      <w:r>
+        <w:t>The application package follows the MVC split; the runtime artefacts live next to it:</w:t>
       </w:r>
     </w:p>
     <w:p>
@@ -599,6 +3150,18 @@
           <w:sz w:val="18"/>
         </w:rPr>
         <w:t>rainrs-server/</w:t>
+        <w:br/>
+        <w:t xml:space="preserve">  src/rainrs_server/</w:t>
+        <w:br/>
+        <w:t xml:space="preserve">    model/      the data model and its catalogue (schema.py)</w:t>
+        <w:br/>
+        <w:t xml:space="preserve">    input/      the capture library (captures.py)</w:t>
+        <w:br/>
+        <w:t xml:space="preserve">    process/    detection (image_read.py) and derivation (rungge.py)</w:t>
+        <w:br/>
+        <w:t xml:space="preserve">    output/     attribute documents (attributes.py),</w:t>
+        <w:br/>
+        <w:t xml:space="preserve">                SQLite persistence (database.py)</w:t>
         <w:br/>
         <w:t xml:space="preserve">  model/content/runs/detect/rain_ripple_yolo26_cpu/weights/best.pt</w:t>
         <w:br/>
@@ -665,7 +3228,7 @@
         <w:pStyle w:val="Heading1"/>
       </w:pPr>
       <w:r>
-        <w:t>8. Command line usage</w:t>
+        <w:t>9. Command line usage</w:t>
       </w:r>
     </w:p>
     <w:p>
@@ -910,7 +3473,7 @@
         <w:pStyle w:val="Heading1"/>
       </w:pPr>
       <w:r>
-        <w:t>9. Security considerations</w:t>
+        <w:t>10. Security considerations</w:t>
       </w:r>
     </w:p>
     <w:p>
@@ -966,7 +3529,7 @@
         <w:pStyle w:val="Heading1"/>
       </w:pPr>
       <w:r>
-        <w:t>10. Limitations and known issues</w:t>
+        <w:t>11. Limitations and known issues</w:t>
       </w:r>
     </w:p>
     <w:p>
@@ -1014,7 +3577,7 @@
         <w:pStyle w:val="Heading1"/>
       </w:pPr>
       <w:r>
-        <w:t>11. Verification results</w:t>
+        <w:t>12. Verification results</w:t>
       </w:r>
     </w:p>
     <w:p>
@@ -1149,6 +3712,28 @@
           </w:tcPr>
           <w:p>
             <w:r>
+              <w:t>Data model</w:t>
+            </w:r>
+          </w:p>
+        </w:tc>
+        <w:tc>
+          <w:tcPr>
+            <w:tcW w:type="dxa" w:w="4320"/>
+          </w:tcPr>
+          <w:p>
+            <w:r>
+              <w:t>the catalogue of rainrs_server/model/schema.py matches the dataclasses (verified by the test suite)</w:t>
+            </w:r>
+          </w:p>
+        </w:tc>
+      </w:tr>
+      <w:tr>
+        <w:tc>
+          <w:tcPr>
+            <w:tcW w:type="dxa" w:w="4320"/>
+          </w:tcPr>
+          <w:p>
+            <w:r>
               <w:t>Unit tests</w:t>
             </w:r>
           </w:p>
@@ -1159,7 +3744,7 @@
           </w:tcPr>
           <w:p>
             <w:r>
-              <w:t>50 tests pass (pytest)</w:t>
+              <w:t>79 tests pass (pytest)</w:t>
             </w:r>
           </w:p>
         </w:tc>

</xml_diff>